<commit_message>
resume: add document detection optimization project v0002-2e0146de
</commit_message>
<xml_diff>
--- a/latest/resume.docx
+++ b/latest/resume.docx
@@ -4,8 +4,9 @@
   <w:body>
     <w:p>
       <w:pPr>
-        <w:widowControl w:val="0"/>
-        <w:spacing w:after="120" w:line="600" w:lineRule="exact"/>
+        <w:keepLines/>
+        <w:widowControl/>
+        <w:spacing w:after="100" w:line="600" w:lineRule="exact" w:before="0"/>
         <w:jc w:val="center"/>
       </w:pPr>
       <w:r>
@@ -20,8 +21,9 @@
     </w:p>
     <w:p>
       <w:pPr>
-        <w:widowControl w:val="0"/>
-        <w:spacing w:after="40" w:line="340" w:lineRule="exact"/>
+        <w:keepLines/>
+        <w:widowControl/>
+        <w:spacing w:after="80" w:line="320" w:lineRule="exact" w:before="0"/>
         <w:jc w:val="center"/>
       </w:pPr>
       <w:r>
@@ -36,8 +38,9 @@
     </w:p>
     <w:p>
       <w:pPr>
-        <w:widowControl w:val="0"/>
-        <w:spacing w:line="300" w:lineRule="exact"/>
+        <w:keepLines/>
+        <w:widowControl/>
+        <w:spacing w:line="260" w:lineRule="exact" w:before="0" w:after="60"/>
         <w:jc w:val="center"/>
       </w:pPr>
       <w:r>
@@ -52,58 +55,64 @@
     </w:p>
     <w:p>
       <w:pPr>
-        <w:keepNext w:val="1"/>
-        <w:widowControl w:val="0"/>
-        <w:spacing w:before="140" w:after="80" w:line="320" w:lineRule="exact"/>
+        <w:keepNext/>
+        <w:keepLines/>
+        <w:widowControl/>
+        <w:spacing w:before="180" w:after="100" w:line="340" w:lineRule="exact"/>
       </w:pPr>
       <w:r>
         <w:rPr>
           <w:rFonts w:hint="eastAsia" w:ascii="Microsoft YaHei" w:hAnsi="Microsoft YaHei" w:eastAsia="微软雅黑"/>
           <w:b w:val="1"/>
           <w:color w:val="235689"/>
-          <w:sz w:val="21"/>
+          <w:sz w:val="24"/>
         </w:rPr>
         <w:t>个人概述</w:t>
       </w:r>
     </w:p>
     <w:p>
       <w:pPr>
-        <w:widowControl w:val="0"/>
+        <w:keepLines/>
+        <w:widowControl/>
+        <w:spacing w:before="0" w:after="60" w:lineRule="exact" w:line="330"/>
       </w:pPr>
       <w:r>
         <w:rPr>
           <w:rFonts w:hint="eastAsia" w:ascii="Microsoft YaHei" w:hAnsi="Microsoft YaHei" w:eastAsia="微软雅黑"/>
           <w:b w:val="0"/>
           <w:color w:val="202B3B"/>
-          <w:sz w:val="17"/>
+          <w:sz w:val="21"/>
         </w:rPr>
         <w:t>北京科技大学人工智能科学与工程硕士在读，具备 RAG、LLM/Agent 工作流、后端服务化与自动化评测实践。曾为研发、测试与运维团队</w:t>
       </w:r>
       <w:r>
-        <w:br w:type="textWrapping"/>
+        <w:rPr>
+          <w:sz w:val="21"/>
+        </w:rPr>
       </w:r>
       <w:r>
         <w:rPr>
           <w:rFonts w:hint="eastAsia" w:ascii="Microsoft YaHei" w:hAnsi="Microsoft YaHei" w:eastAsia="微软雅黑"/>
           <w:b w:val="0"/>
           <w:color w:val="202B3B"/>
-          <w:sz w:val="17"/>
+          <w:sz w:val="21"/>
         </w:rPr>
         <w:t>构建知识库问答系统，并在医学项目中通过流程重构提升评测指标、降低模型调用成本，相关经验可迁移至专利、医学等垂直场景 Agent 应用。</w:t>
       </w:r>
     </w:p>
     <w:p>
       <w:pPr>
-        <w:keepNext w:val="1"/>
-        <w:widowControl w:val="0"/>
-        <w:spacing w:before="140" w:after="80" w:line="320" w:lineRule="exact"/>
+        <w:keepNext/>
+        <w:keepLines/>
+        <w:widowControl/>
+        <w:spacing w:before="180" w:after="100" w:line="340" w:lineRule="exact"/>
       </w:pPr>
       <w:r>
         <w:rPr>
           <w:rFonts w:hint="eastAsia" w:ascii="Microsoft YaHei" w:hAnsi="Microsoft YaHei" w:eastAsia="微软雅黑"/>
           <w:b w:val="1"/>
           <w:color w:val="235689"/>
-          <w:sz w:val="21"/>
+          <w:sz w:val="24"/>
         </w:rPr>
         <w:t>核心能力</w:t>
       </w:r>
@@ -111,7 +120,9 @@
     <w:p>
       <w:pPr>
         <w:pStyle w:val="000002"/>
-        <w:spacing w:after="0" w:line="310" w:lineRule="exact"/>
+        <w:keepLines/>
+        <w:widowControl/>
+        <w:spacing w:after="60" w:line="330" w:lineRule="exact" w:before="0"/>
         <w:rPr>
           <w:rFonts w:ascii="Microsoft YaHei" w:hAnsi="Microsoft YaHei" w:eastAsia="微软雅黑"/>
           <w:color w:val="202B3B"/>
@@ -122,7 +133,7 @@
         <w:rPr>
           <w:rFonts w:hint="eastAsia" w:ascii="微软雅黑" w:hAnsi="微软雅黑" w:eastAsia="微软雅黑" w:cs="微软雅黑"/>
           <w:color w:val="202B3B"/>
-          <w:sz w:val="17"/>
+          <w:sz w:val="21"/>
           <w:szCs w:val="17"/>
         </w:rPr>
         <w:t>具备 RAG 全链路搭建、LLM/Agent 工作流设计与自动化评测、后端服务化的完整工程落地能力。</w:t>
@@ -130,136 +141,136 @@
     </w:p>
     <w:p>
       <w:pPr>
-        <w:keepNext w:val="1"/>
-        <w:widowControl w:val="0"/>
-        <w:spacing w:before="140" w:after="80" w:line="320" w:lineRule="exact"/>
+        <w:keepNext/>
+        <w:keepLines/>
+        <w:widowControl/>
+        <w:spacing w:before="180" w:after="100" w:line="340" w:lineRule="exact"/>
       </w:pPr>
       <w:r>
         <w:rPr>
           <w:rFonts w:hint="eastAsia" w:ascii="Microsoft YaHei" w:hAnsi="Microsoft YaHei" w:eastAsia="微软雅黑"/>
           <w:b w:val="1"/>
           <w:color w:val="235689"/>
-          <w:sz w:val="21"/>
+          <w:sz w:val="24"/>
         </w:rPr>
         <w:t>项目经历</w:t>
       </w:r>
     </w:p>
     <w:p>
       <w:pPr>
-        <w:keepNext w:val="1"/>
-        <w:widowControl w:val="0"/>
-        <w:spacing w:before="40" w:line="320" w:lineRule="exact"/>
+        <w:keepNext/>
+        <w:keepLines/>
+        <w:widowControl/>
+        <w:spacing w:before="100" w:line="330" w:lineRule="exact" w:after="80"/>
       </w:pPr>
       <w:r>
         <w:rPr>
           <w:rFonts w:hint="eastAsia" w:ascii="Microsoft YaHei" w:hAnsi="Microsoft YaHei" w:eastAsia="微软雅黑"/>
           <w:b w:val="1"/>
           <w:color w:val="202B3B"/>
-          <w:sz w:val="18"/>
+          <w:sz w:val="21"/>
         </w:rPr>
-        <w:t>RAG 问答系统搭建｜2025.08—2025.11</w:t>
-      </w:r>
-    </w:p>
-    <w:p>
-      <w:pPr>
-        <w:widowControl w:val="0"/>
-        <w:ind w:left="196" w:hanging="142"/>
-      </w:pPr>
-      <w:r>
-        <w:rPr>
-          <w:rFonts w:hint="eastAsia" w:ascii="Microsoft YaHei" w:hAnsi="Microsoft YaHei" w:eastAsia="微软雅黑"/>
-          <w:b w:val="0"/>
-          <w:color w:val="202B3B"/>
-          <w:sz w:val="17"/>
-        </w:rPr>
-        <w:t>• 从 0 到 1 构建面向无人驾驶清洁车业务的本地知识库问答系统，整合 5000+ 份多模态技术文档，服务 200+ 名研发、测试与现场运维工</w:t>
-      </w:r>
-      <w:r>
-        <w:br w:type="textWrapping"/>
-      </w:r>
-      <w:r>
-        <w:rPr>
-          <w:rFonts w:hint="eastAsia" w:ascii="Microsoft YaHei" w:hAnsi="Microsoft YaHei" w:eastAsia="微软雅黑"/>
-          <w:b w:val="0"/>
-          <w:color w:val="202B3B"/>
-          <w:sz w:val="17"/>
-        </w:rPr>
-        <w:t>程师；日均处理 300+ 次咨询，TTFT &lt; 2 秒，答案准确率 94%，人工排查工作量降低 60%。</w:t>
-      </w:r>
-    </w:p>
-    <w:p>
-      <w:pPr>
-        <w:widowControl w:val="0"/>
-        <w:ind w:left="196" w:hanging="142"/>
-      </w:pPr>
-      <w:r>
-        <w:rPr>
-          <w:rFonts w:hint="eastAsia" w:ascii="Microsoft YaHei" w:hAnsi="Microsoft YaHei" w:eastAsia="微软雅黑"/>
-          <w:b w:val="0"/>
-          <w:color w:val="202B3B"/>
-          <w:sz w:val="17"/>
-        </w:rPr>
-        <w:t>• 设计文档处理、向量化存储、多级检索与生成优化模块；基于 MinerU、OCR、版面分析、规则与图像预处理优化 PDF 解析，并以</w:t>
-      </w:r>
-      <w:r>
-        <w:br w:type="textWrapping"/>
-      </w:r>
-      <w:r>
-        <w:rPr>
-          <w:rFonts w:hint="eastAsia" w:ascii="Microsoft YaHei" w:hAnsi="Microsoft YaHei" w:eastAsia="微软雅黑"/>
-          <w:b w:val="0"/>
-          <w:color w:val="202B3B"/>
-          <w:sz w:val="17"/>
-        </w:rPr>
-        <w:t>Token 计数设计 Chunk 切分。</w:t>
-      </w:r>
-    </w:p>
-    <w:p>
-      <w:pPr>
-        <w:widowControl w:val="0"/>
-        <w:ind w:left="196" w:hanging="142"/>
-      </w:pPr>
-      <w:r>
-        <w:rPr>
-          <w:rFonts w:hint="eastAsia" w:ascii="Microsoft YaHei" w:hAnsi="Microsoft YaHei" w:eastAsia="微软雅黑"/>
-          <w:b w:val="0"/>
-          <w:color w:val="202B3B"/>
-          <w:sz w:val="17"/>
-        </w:rPr>
-        <w:t>• 使用 LLM + few-shot 实现意图分类并动态匹配检索策略与回答模板；通过问题重写、粗搜 + 精搜、混合召回和 bge-reranker-v2 重排</w:t>
-      </w:r>
-      <w:r>
-        <w:br w:type="textWrapping"/>
-      </w:r>
-      <w:r>
-        <w:rPr>
-          <w:rFonts w:hint="eastAsia" w:ascii="Microsoft YaHei" w:hAnsi="Microsoft YaHei" w:eastAsia="微软雅黑"/>
-          <w:b w:val="0"/>
-          <w:color w:val="202B3B"/>
-          <w:sz w:val="17"/>
-        </w:rPr>
-        <w:t>序，将 Recall@5 从 47% 提升至 85%。</w:t>
-      </w:r>
-    </w:p>
-    <w:p>
-      <w:pPr>
-        <w:widowControl w:val="0"/>
-        <w:ind w:left="196" w:hanging="142"/>
-      </w:pPr>
-      <w:r>
-        <w:rPr>
-          <w:rFonts w:hint="eastAsia" w:ascii="Microsoft YaHei" w:hAnsi="Microsoft YaHei" w:eastAsia="微软雅黑"/>
-          <w:b w:val="0"/>
-          <w:color w:val="202B3B"/>
-          <w:sz w:val="17"/>
-        </w:rPr>
-        <w:t>• 集成飞书前端与 Dify 工作流，支撑日均 200+ 访问，并每周自动处理 20+ 份新增技术文档。</w:t>
+        <w:t>证件篡改检测系统评测与优化｜2026.09—2026.10</w:t>
       </w:r>
     </w:p>
     <w:p>
       <w:pPr>
         <w:pStyle w:val="000002"/>
-        <w:spacing w:before="20" w:after="40" w:line="310" w:lineRule="exact"/>
+        <w:keepLines/>
+        <w:widowControl/>
+        <w:spacing w:before="0" w:after="60" w:line="330" w:lineRule="exact"/>
+        <w:ind w:left="196" w:hanging="142"/>
+        <w:rPr>
+          <w:rFonts w:ascii="Microsoft YaHei" w:hAnsi="Microsoft YaHei" w:eastAsia="微软雅黑"/>
+          <w:color w:val="202B3B"/>
+          <w:sz w:val="17"/>
+        </w:rPr>
+      </w:pPr>
+      <w:r>
+        <w:rPr>
+          <w:rFonts w:hint="eastAsia" w:ascii="微软雅黑" w:hAnsi="微软雅黑" w:eastAsia="微软雅黑" w:cs="微软雅黑"/>
+          <w:color w:val="202B3B"/>
+          <w:sz w:val="21"/>
+          <w:szCs w:val="17"/>
+        </w:rPr>
+        <w:t>• 接手身份证、护照 PS 与 AIGC 联合检测项目，复测 HTTP 接口并逐样本核对原始响应、分域阈值及召回/误报；排查 OCR 取框、DTD/TruFor/FFDN 融合与校准流程，定位实际表现与预期的差距。</w:t>
+      </w:r>
+    </w:p>
+    <w:p>
+      <w:pPr>
+        <w:pStyle w:val="000002"/>
+        <w:keepLines/>
+        <w:widowControl/>
+        <w:spacing w:before="0" w:after="60" w:line="330" w:lineRule="exact"/>
+        <w:ind w:left="196" w:hanging="142"/>
+        <w:rPr>
+          <w:rFonts w:ascii="Microsoft YaHei" w:hAnsi="Microsoft YaHei" w:eastAsia="微软雅黑"/>
+          <w:color w:val="202B3B"/>
+          <w:sz w:val="17"/>
+        </w:rPr>
+      </w:pPr>
+      <w:r>
+        <w:rPr>
+          <w:rFonts w:hint="eastAsia" w:ascii="微软雅黑" w:hAnsi="微软雅黑" w:eastAsia="微软雅黑" w:cs="微软雅黑"/>
+          <w:color w:val="202B3B"/>
+          <w:sz w:val="21"/>
+          <w:szCs w:val="17"/>
+        </w:rPr>
+        <w:t>• 增加身份证号码、护照 MRZ、日期及跨字段一致性校验，区分视觉命中、规则命中与人工复核；修复 OCR 跨标签字段误关联，对低置信度或格式异常保留复核处理。</w:t>
+      </w:r>
+    </w:p>
+    <w:p>
+      <w:pPr>
+        <w:pStyle w:val="000002"/>
+        <w:keepLines/>
+        <w:widowControl/>
+        <w:spacing w:before="0" w:after="60" w:line="330" w:lineRule="exact"/>
+        <w:ind w:left="196" w:hanging="142"/>
+        <w:rPr>
+          <w:rFonts w:ascii="Microsoft YaHei" w:hAnsi="Microsoft YaHei" w:eastAsia="微软雅黑"/>
+          <w:color w:val="202B3B"/>
+          <w:sz w:val="17"/>
+        </w:rPr>
+      </w:pPr>
+      <w:r>
+        <w:rPr>
+          <w:rFonts w:hint="eastAsia" w:ascii="微软雅黑" w:hAnsi="微软雅黑" w:eastAsia="微软雅黑" w:cs="微软雅黑"/>
+          <w:color w:val="202B3B"/>
+          <w:sz w:val="21"/>
+          <w:szCs w:val="17"/>
+        </w:rPr>
+        <w:t>• 将入口 Q95 二次压缩调整为保留原始解码像素，补齐三模型长文字框窗口覆盖，统一整图与区域融合策略；保留旧链路用于对照，新方案尚未部署。</w:t>
+      </w:r>
+    </w:p>
+    <w:p>
+      <w:pPr>
+        <w:pStyle w:val="000002"/>
+        <w:keepLines/>
+        <w:widowControl/>
+        <w:spacing w:before="0" w:after="60" w:line="330" w:lineRule="exact"/>
+        <w:ind w:left="196" w:hanging="142"/>
+        <w:rPr>
+          <w:rFonts w:ascii="Microsoft YaHei" w:hAnsi="Microsoft YaHei" w:eastAsia="微软雅黑"/>
+          <w:color w:val="202B3B"/>
+          <w:sz w:val="17"/>
+        </w:rPr>
+      </w:pPr>
+      <w:r>
+        <w:rPr>
+          <w:rFonts w:hint="eastAsia" w:ascii="微软雅黑" w:hAnsi="微软雅黑" w:eastAsia="微软雅黑" w:cs="微软雅黑"/>
+          <w:color w:val="202B3B"/>
+          <w:sz w:val="21"/>
+          <w:szCs w:val="17"/>
+        </w:rPr>
+        <w:t>• 完成 1,050 条历史样本的新旧链路配对回归（0 失败）；增加同源组与图片哈希隔离、代码/权重/配置指纹核验，以 986 条过滤后记录回放冻结策略，按分域误报约束评估改动。</w:t>
+      </w:r>
+    </w:p>
+    <w:p>
+      <w:pPr>
+        <w:pStyle w:val="000002"/>
+        <w:keepLines/>
+        <w:widowControl/>
+        <w:spacing w:before="20" w:after="100" w:line="330" w:lineRule="exact"/>
         <w:ind w:left="196"/>
         <w:rPr>
           <w:rFonts w:ascii="Microsoft YaHei" w:hAnsi="Microsoft YaHei" w:eastAsia="微软雅黑"/>
@@ -272,7 +283,7 @@
           <w:rFonts w:hint="eastAsia" w:ascii="微软雅黑" w:hAnsi="微软雅黑" w:eastAsia="微软雅黑" w:cs="微软雅黑"/>
           <w:b w:val="1"/>
           <w:color w:val="4A5A6E"/>
-          <w:sz w:val="17"/>
+          <w:sz w:val="19"/>
           <w:szCs w:val="17"/>
         </w:rPr>
         <w:t>技术栈：</w:t>
@@ -281,117 +292,145 @@
         <w:rPr>
           <w:rFonts w:hint="eastAsia" w:ascii="微软雅黑" w:hAnsi="微软雅黑" w:eastAsia="微软雅黑" w:cs="微软雅黑"/>
           <w:color w:val="4A5A6E"/>
-          <w:sz w:val="17"/>
+          <w:sz w:val="19"/>
           <w:szCs w:val="17"/>
         </w:rPr>
-        <w:t>Python、MinerU、OCR 与版面分析、Token 计数 Chunk 切分、混合召回、bge-reranker-v2、LLM + few-shot、Dify、飞书开放平台</w:t>
+        <w:t>Python、PaddleOCR、OpenCV、NumPy、DTD / TruFor / FFDN、多模型融合、规则校验、回归评测</w:t>
       </w:r>
     </w:p>
     <w:p>
       <w:pPr>
-        <w:keepNext w:val="1"/>
-        <w:widowControl w:val="0"/>
-        <w:spacing w:before="140" w:after="80" w:line="320" w:lineRule="exact"/>
+        <w:keepNext/>
+        <w:keepLines/>
+        <w:widowControl/>
+        <w:spacing w:before="100" w:line="330" w:lineRule="exact" w:after="80"/>
       </w:pPr>
       <w:r>
         <w:rPr>
           <w:rFonts w:hint="eastAsia" w:ascii="Microsoft YaHei" w:hAnsi="Microsoft YaHei" w:eastAsia="微软雅黑"/>
           <w:b w:val="1"/>
-          <w:color w:val="235689"/>
+          <w:color w:val="202B3B"/>
           <w:sz w:val="21"/>
         </w:rPr>
-        <w:t>实习经历</w:t>
+        <w:t>RAG 问答系统搭建｜2025.08—2025.11</w:t>
+      </w:r>
+    </w:p>
+    <w:p>
+      <w:pPr>
+        <w:keepLines/>
+        <w:widowControl/>
+        <w:spacing w:before="0" w:after="60" w:lineRule="exact" w:line="330"/>
+        <w:ind w:left="196" w:hanging="142"/>
+      </w:pPr>
+      <w:r>
+        <w:rPr>
+          <w:rFonts w:hint="eastAsia" w:ascii="Microsoft YaHei" w:hAnsi="Microsoft YaHei" w:eastAsia="微软雅黑"/>
+          <w:b w:val="0"/>
+          <w:color w:val="202B3B"/>
+          <w:sz w:val="21"/>
+        </w:rPr>
+        <w:t>• 从 0 到 1 构建面向无人驾驶清洁车业务的本地知识库问答系统，整合 5000+ 份多模态技术文档，服务 200+ 名研发、测试与现场运维工</w:t>
+      </w:r>
+      <w:r>
+        <w:rPr>
+          <w:sz w:val="21"/>
+        </w:rPr>
+      </w:r>
+      <w:r>
+        <w:rPr>
+          <w:rFonts w:hint="eastAsia" w:ascii="Microsoft YaHei" w:hAnsi="Microsoft YaHei" w:eastAsia="微软雅黑"/>
+          <w:b w:val="0"/>
+          <w:color w:val="202B3B"/>
+          <w:sz w:val="21"/>
+        </w:rPr>
+        <w:t>程师；日均处理 300+ 次咨询，TTFT &lt; 2 秒，答案准确率 94%，人工排查工作量降低 60%。</w:t>
+      </w:r>
+    </w:p>
+    <w:p>
+      <w:pPr>
+        <w:keepLines/>
+        <w:widowControl/>
+        <w:spacing w:before="0" w:after="60" w:lineRule="exact" w:line="330"/>
+        <w:ind w:left="196" w:hanging="142"/>
+      </w:pPr>
+      <w:r>
+        <w:rPr>
+          <w:rFonts w:hint="eastAsia" w:ascii="Microsoft YaHei" w:hAnsi="Microsoft YaHei" w:eastAsia="微软雅黑"/>
+          <w:b w:val="0"/>
+          <w:color w:val="202B3B"/>
+          <w:sz w:val="21"/>
+        </w:rPr>
+        <w:t>• 设计文档处理、向量化存储、多级检索与生成优化模块；基于 MinerU、OCR、版面分析、规则与图像预处理优化 PDF 解析，并以</w:t>
+      </w:r>
+      <w:r>
+        <w:rPr>
+          <w:sz w:val="21"/>
+        </w:rPr>
+      </w:r>
+      <w:r>
+        <w:rPr>
+          <w:rFonts w:hint="eastAsia" w:ascii="Microsoft YaHei" w:hAnsi="Microsoft YaHei" w:eastAsia="微软雅黑"/>
+          <w:b w:val="0"/>
+          <w:color w:val="202B3B"/>
+          <w:sz w:val="21"/>
+        </w:rPr>
+        <w:t>Token 计数设计 Chunk 切分。</w:t>
+      </w:r>
+    </w:p>
+    <w:p>
+      <w:pPr>
+        <w:keepLines/>
+        <w:widowControl/>
+        <w:spacing w:before="0" w:after="60" w:lineRule="exact" w:line="330"/>
+        <w:ind w:left="196" w:hanging="142"/>
+      </w:pPr>
+      <w:r>
+        <w:rPr>
+          <w:rFonts w:hint="eastAsia" w:ascii="Microsoft YaHei" w:hAnsi="Microsoft YaHei" w:eastAsia="微软雅黑"/>
+          <w:b w:val="0"/>
+          <w:color w:val="202B3B"/>
+          <w:sz w:val="21"/>
+        </w:rPr>
+        <w:t>• 使用 LLM + few-shot 实现意图分类并动态匹配检索策略与回答模板；通过问题重写、粗搜 + 精搜、混合召回和 bge-reranker-v2 重排</w:t>
+      </w:r>
+      <w:r>
+        <w:rPr>
+          <w:sz w:val="21"/>
+        </w:rPr>
+      </w:r>
+      <w:r>
+        <w:rPr>
+          <w:rFonts w:hint="eastAsia" w:ascii="Microsoft YaHei" w:hAnsi="Microsoft YaHei" w:eastAsia="微软雅黑"/>
+          <w:b w:val="0"/>
+          <w:color w:val="202B3B"/>
+          <w:sz w:val="21"/>
+        </w:rPr>
+        <w:t>序，将 Recall@5 从 47% 提升至 85%。</w:t>
+      </w:r>
+    </w:p>
+    <w:p>
+      <w:pPr>
+        <w:keepLines/>
+        <w:widowControl/>
+        <w:spacing w:before="0" w:after="60" w:lineRule="exact" w:line="330"/>
+        <w:ind w:left="196" w:hanging="142"/>
+      </w:pPr>
+      <w:r>
+        <w:rPr>
+          <w:rFonts w:hint="eastAsia" w:ascii="Microsoft YaHei" w:hAnsi="Microsoft YaHei" w:eastAsia="微软雅黑"/>
+          <w:b w:val="0"/>
+          <w:color w:val="202B3B"/>
+          <w:sz w:val="21"/>
+        </w:rPr>
+        <w:t>• 集成飞书前端与 Dify 工作流，支撑日均 200+ 访问，并每周自动处理 20+ 份新增技术文档。</w:t>
       </w:r>
     </w:p>
     <w:p>
       <w:pPr>
         <w:pStyle w:val="000002"/>
-        <w:keepNext w:val="1"/>
-        <w:spacing w:before="40" w:after="0" w:line="320" w:lineRule="exact"/>
-        <w:rPr>
-          <w:rFonts w:ascii="Microsoft YaHei" w:hAnsi="Microsoft YaHei" w:eastAsia="微软雅黑"/>
-          <w:color w:val="202B3B"/>
-          <w:sz w:val="17"/>
-        </w:rPr>
-      </w:pPr>
-      <w:r>
-        <w:rPr>
-          <w:rFonts w:hint="eastAsia" w:ascii="微软雅黑" w:hAnsi="微软雅黑" w:eastAsia="微软雅黑" w:cs="微软雅黑"/>
-          <w:b w:val="1"/>
-          <w:color w:val="202B3B"/>
-          <w:sz w:val="18"/>
-          <w:szCs w:val="18"/>
-        </w:rPr>
-        <w:t>TransferEasy｜算法实习生（专利 Agent 开发）｜北京｜2026.08—至今</w:t>
-      </w:r>
-    </w:p>
-    <w:p>
-      <w:pPr>
-        <w:pStyle w:val="000002"/>
-        <w:spacing w:before="0" w:after="0" w:line="310" w:lineRule="exact"/>
-        <w:ind w:left="196" w:hanging="142"/>
-        <w:rPr>
-          <w:rFonts w:ascii="Microsoft YaHei" w:hAnsi="Microsoft YaHei" w:eastAsia="微软雅黑"/>
-          <w:color w:val="202B3B"/>
-          <w:sz w:val="17"/>
-        </w:rPr>
-      </w:pPr>
-      <w:r>
-        <w:rPr>
-          <w:rFonts w:hint="eastAsia" w:ascii="微软雅黑" w:hAnsi="微软雅黑" w:eastAsia="微软雅黑" w:cs="微软雅黑"/>
-          <w:color w:val="202B3B"/>
-          <w:sz w:val="17"/>
-          <w:szCs w:val="17"/>
-        </w:rPr>
-        <w:t>• 基于 Python、Flask 与 LangGraph 构建专利生成工作流，串联技术特征提取、交底书撰写、权利要求优化、说明书与摘要生成、检查及导出，实现同一技术底稿驱动四类文档生成。</w:t>
-      </w:r>
-    </w:p>
-    <w:p>
-      <w:pPr>
-        <w:pStyle w:val="000002"/>
-        <w:spacing w:before="0" w:after="0" w:line="310" w:lineRule="exact"/>
-        <w:ind w:left="196" w:hanging="142"/>
-        <w:rPr>
-          <w:rFonts w:ascii="Microsoft YaHei" w:hAnsi="Microsoft YaHei" w:eastAsia="微软雅黑"/>
-          <w:color w:val="202B3B"/>
-          <w:sz w:val="17"/>
-        </w:rPr>
-      </w:pPr>
-      <w:r>
-        <w:rPr>
-          <w:rFonts w:hint="eastAsia" w:ascii="微软雅黑" w:hAnsi="微软雅黑" w:eastAsia="微软雅黑" w:cs="微软雅黑"/>
-          <w:color w:val="202B3B"/>
-          <w:sz w:val="17"/>
-          <w:szCs w:val="17"/>
-        </w:rPr>
-        <w:t>• 设计 FactStore 与来源支持映射，对代码、技术文档分块提取并校验原文摘录及位置；结合 JSON Schema、语义复核与条件修订分支，拦截无来源内容，提升生成结果的可追溯性与一致性。</w:t>
-      </w:r>
-    </w:p>
-    <w:p>
-      <w:pPr>
-        <w:pStyle w:val="000002"/>
-        <w:spacing w:before="0" w:after="0" w:line="310" w:lineRule="exact"/>
-        <w:ind w:left="196" w:hanging="142"/>
-        <w:rPr>
-          <w:rFonts w:ascii="Microsoft YaHei" w:hAnsi="Microsoft YaHei" w:eastAsia="微软雅黑"/>
-          <w:color w:val="202B3B"/>
-          <w:sz w:val="17"/>
-        </w:rPr>
-      </w:pPr>
-      <w:r>
-        <w:rPr>
-          <w:rFonts w:hint="eastAsia" w:ascii="微软雅黑" w:hAnsi="微软雅黑" w:eastAsia="微软雅黑" w:cs="微软雅黑"/>
-          <w:color w:val="202B3B"/>
-          <w:sz w:val="17"/>
-          <w:szCs w:val="17"/>
-        </w:rPr>
-        <w:t>• 基于 Flask API 实现异步任务、进度查询与版本快照，支持四类文档分别导出 MD/DOCX；接入独立评测服务，展示分项评分与问题报告，保留失败记录及历史完整版本。</w:t>
-      </w:r>
-    </w:p>
-    <w:p>
-      <w:pPr>
-        <w:pStyle w:val="000002"/>
-        <w:spacing w:before="20" w:after="40" w:line="310" w:lineRule="exact"/>
+        <w:keepLines/>
+        <w:widowControl/>
+        <w:spacing w:before="20" w:after="100" w:line="330" w:lineRule="exact"/>
         <w:ind w:left="196"/>
         <w:rPr>
           <w:rFonts w:ascii="Microsoft YaHei" w:hAnsi="Microsoft YaHei" w:eastAsia="微软雅黑"/>
@@ -404,7 +443,7 @@
           <w:rFonts w:hint="eastAsia" w:ascii="微软雅黑" w:hAnsi="微软雅黑" w:eastAsia="微软雅黑" w:cs="微软雅黑"/>
           <w:b w:val="1"/>
           <w:color w:val="4A5A6E"/>
-          <w:sz w:val="17"/>
+          <w:sz w:val="19"/>
           <w:szCs w:val="17"/>
         </w:rPr>
         <w:t>技术栈：</w:t>
@@ -413,32 +452,37 @@
         <w:rPr>
           <w:rFonts w:hint="eastAsia" w:ascii="微软雅黑" w:hAnsi="微软雅黑" w:eastAsia="微软雅黑" w:cs="微软雅黑"/>
           <w:color w:val="4A5A6E"/>
-          <w:sz w:val="17"/>
+          <w:sz w:val="19"/>
           <w:szCs w:val="17"/>
         </w:rPr>
-        <w:t>Python、Flask、LangGraph、JSON Schema、FactStore、异步任务与版本快照、MD/DOCX 导出</w:t>
+        <w:t>Python、MinerU、OCR 与版面分析、Token 计数 Chunk 切分、混合召回、bge-reranker-v2、LLM + few-shot、Dify、飞书开放平台</w:t>
       </w:r>
     </w:p>
     <w:p>
       <w:pPr>
-        <w:widowControl w:val="0"/>
+        <w:keepNext/>
+        <w:keepLines/>
+        <w:pageBreakBefore/>
+        <w:widowControl/>
+        <w:spacing w:before="0" w:after="100" w:line="340" w:lineRule="exact"/>
       </w:pPr>
       <w:r>
         <w:rPr>
-          <w:rFonts w:hint="eastAsia" w:ascii="微软雅黑" w:hAnsi="微软雅黑" w:eastAsia="微软雅黑" w:cs="微软雅黑"/>
+          <w:rFonts w:hint="eastAsia" w:ascii="Microsoft YaHei" w:hAnsi="Microsoft YaHei" w:eastAsia="微软雅黑"/>
           <w:b w:val="1"/>
-          <w:color w:val="202B3B"/>
-          <w:sz w:val="18"/>
-          <w:szCs w:val="18"/>
+          <w:color w:val="235689"/>
+          <w:sz w:val="24"/>
         </w:rPr>
-        <w:t>水木分子｜算法实习生｜北京｜2026.01—2026.05</w:t>
+        <w:t>实习经历</w:t>
       </w:r>
     </w:p>
     <w:p>
       <w:pPr>
         <w:pStyle w:val="000002"/>
-        <w:keepNext w:val="1"/>
-        <w:spacing w:before="60" w:after="0" w:line="310" w:lineRule="exact"/>
+        <w:keepNext/>
+        <w:keepLines/>
+        <w:widowControl/>
+        <w:spacing w:before="100" w:after="80" w:line="330" w:lineRule="exact"/>
         <w:rPr>
           <w:rFonts w:ascii="Microsoft YaHei" w:hAnsi="Microsoft YaHei" w:eastAsia="微软雅黑"/>
           <w:color w:val="202B3B"/>
@@ -450,16 +494,18 @@
           <w:rFonts w:hint="eastAsia" w:ascii="微软雅黑" w:hAnsi="微软雅黑" w:eastAsia="微软雅黑" w:cs="微软雅黑"/>
           <w:b w:val="1"/>
           <w:color w:val="202B3B"/>
-          <w:sz w:val="17"/>
-          <w:szCs w:val="17"/>
+          <w:sz w:val="21"/>
+          <w:szCs w:val="18"/>
         </w:rPr>
-        <w:t>医学信息抽取流水线</w:t>
+        <w:t>TransferEasy｜算法实习生（专利 Agent 开发）｜北京｜2026.08—至今</w:t>
       </w:r>
     </w:p>
     <w:p>
       <w:pPr>
         <w:pStyle w:val="000002"/>
-        <w:spacing w:before="0" w:after="0" w:line="310" w:lineRule="exact"/>
+        <w:keepLines/>
+        <w:widowControl/>
+        <w:spacing w:before="0" w:after="60" w:line="330" w:lineRule="exact"/>
         <w:ind w:left="196" w:hanging="142"/>
         <w:rPr>
           <w:rFonts w:ascii="Microsoft YaHei" w:hAnsi="Microsoft YaHei" w:eastAsia="微软雅黑"/>
@@ -471,16 +517,18 @@
         <w:rPr>
           <w:rFonts w:hint="eastAsia" w:ascii="微软雅黑" w:hAnsi="微软雅黑" w:eastAsia="微软雅黑" w:cs="微软雅黑"/>
           <w:color w:val="202B3B"/>
-          <w:sz w:val="17"/>
+          <w:sz w:val="21"/>
           <w:szCs w:val="17"/>
         </w:rPr>
-        <w:t>• 面向百万级医学文献构建 LLM 驱动的信息抽取 Pipeline，设计“实体抽取-关系识别-结果验证”多阶段工作流，自动生成疾病-信号通路调控关系三元组，支撑医学知识图谱构建。</w:t>
+        <w:t>• 基于 Python、Flask 与 LangGraph 构建专利生成工作流，串联技术特征提取、交底书撰写、权利要求优化、说明书与摘要生成、检查及导出，实现同一技术底稿驱动四类文档生成。</w:t>
       </w:r>
     </w:p>
     <w:p>
       <w:pPr>
         <w:pStyle w:val="000002"/>
-        <w:spacing w:before="0" w:after="0" w:line="310" w:lineRule="exact"/>
+        <w:keepLines/>
+        <w:widowControl/>
+        <w:spacing w:before="0" w:after="60" w:line="330" w:lineRule="exact"/>
         <w:ind w:left="196" w:hanging="142"/>
         <w:rPr>
           <w:rFonts w:ascii="Microsoft YaHei" w:hAnsi="Microsoft YaHei" w:eastAsia="微软雅黑"/>
@@ -492,16 +540,41 @@
         <w:rPr>
           <w:rFonts w:hint="eastAsia" w:ascii="微软雅黑" w:hAnsi="微软雅黑" w:eastAsia="微软雅黑" w:cs="微软雅黑"/>
           <w:color w:val="202B3B"/>
-          <w:sz w:val="17"/>
+          <w:sz w:val="21"/>
           <w:szCs w:val="17"/>
         </w:rPr>
-        <w:t>• 针对医学关系抽取任务进行 LLM Workflow 优化，对比 LangGraph 逐实体对判别方案与段落级批量抽取方案，最终设计“实体联合抽取 → 上下文关系判别”的高效 Pipeline，并构建自动化评测体系；通过流程重构与 Prompt 优化，实现 Recall 63%→82%、Accuracy 72%→87%，模型调用成本降低 95%+。</w:t>
+        <w:t>• 设计 FactStore 与来源支持映射，对代码、技术文档分块提取并校验原文摘录及位置；结合 JSON Schema、语义复核与条件修订分支，拦截无来源内容，提升生成结果的可追溯性与一致性。</w:t>
       </w:r>
     </w:p>
     <w:p>
       <w:pPr>
         <w:pStyle w:val="000002"/>
-        <w:spacing w:before="20" w:after="40" w:line="310" w:lineRule="exact"/>
+        <w:keepLines/>
+        <w:widowControl/>
+        <w:spacing w:before="0" w:after="60" w:line="330" w:lineRule="exact"/>
+        <w:ind w:left="196" w:hanging="142"/>
+        <w:rPr>
+          <w:rFonts w:ascii="Microsoft YaHei" w:hAnsi="Microsoft YaHei" w:eastAsia="微软雅黑"/>
+          <w:color w:val="202B3B"/>
+          <w:sz w:val="17"/>
+        </w:rPr>
+      </w:pPr>
+      <w:r>
+        <w:rPr>
+          <w:rFonts w:hint="eastAsia" w:ascii="微软雅黑" w:hAnsi="微软雅黑" w:eastAsia="微软雅黑" w:cs="微软雅黑"/>
+          <w:color w:val="202B3B"/>
+          <w:sz w:val="21"/>
+          <w:szCs w:val="17"/>
+        </w:rPr>
+        <w:t>• 基于 Flask API 实现异步任务、进度查询与版本快照，支持四类文档分别导出 MD/DOCX；接入独立评测服务，展示分项评分与问题报告，保留失败记录及历史完整版本。</w:t>
+      </w:r>
+    </w:p>
+    <w:p>
+      <w:pPr>
+        <w:pStyle w:val="000002"/>
+        <w:keepLines/>
+        <w:widowControl/>
+        <w:spacing w:before="20" w:after="100" w:line="330" w:lineRule="exact"/>
         <w:ind w:left="196"/>
         <w:rPr>
           <w:rFonts w:ascii="Microsoft YaHei" w:hAnsi="Microsoft YaHei" w:eastAsia="微软雅黑"/>
@@ -514,7 +587,7 @@
           <w:rFonts w:hint="eastAsia" w:ascii="微软雅黑" w:hAnsi="微软雅黑" w:eastAsia="微软雅黑" w:cs="微软雅黑"/>
           <w:b w:val="1"/>
           <w:color w:val="4A5A6E"/>
-          <w:sz w:val="17"/>
+          <w:sz w:val="19"/>
           <w:szCs w:val="17"/>
         </w:rPr>
         <w:t>技术栈：</w:t>
@@ -523,17 +596,37 @@
         <w:rPr>
           <w:rFonts w:hint="eastAsia" w:ascii="微软雅黑" w:hAnsi="微软雅黑" w:eastAsia="微软雅黑" w:cs="微软雅黑"/>
           <w:color w:val="4A5A6E"/>
-          <w:sz w:val="17"/>
+          <w:sz w:val="19"/>
           <w:szCs w:val="17"/>
         </w:rPr>
-        <w:t>Python、LLM 多阶段抽取、LangGraph、Prompt 工程、自动化评测体系</w:t>
+        <w:t>Python、Flask、LangGraph、JSON Schema、FactStore、异步任务与版本快照、MD/DOCX 导出</w:t>
+      </w:r>
+    </w:p>
+    <w:p>
+      <w:pPr>
+        <w:keepNext/>
+        <w:keepLines/>
+        <w:widowControl/>
+        <w:spacing w:before="100" w:after="80" w:lineRule="exact" w:line="330"/>
+      </w:pPr>
+      <w:r>
+        <w:rPr>
+          <w:rFonts w:hint="eastAsia" w:ascii="微软雅黑" w:hAnsi="微软雅黑" w:eastAsia="微软雅黑" w:cs="微软雅黑"/>
+          <w:b w:val="1"/>
+          <w:color w:val="202B3B"/>
+          <w:sz w:val="21"/>
+          <w:szCs w:val="18"/>
+        </w:rPr>
+        <w:t>水木分子｜算法实习生｜北京｜2026.01—2026.05</w:t>
       </w:r>
     </w:p>
     <w:p>
       <w:pPr>
         <w:pStyle w:val="000002"/>
-        <w:keepNext w:val="1"/>
-        <w:spacing w:before="60" w:after="0" w:line="310" w:lineRule="exact"/>
+        <w:keepNext/>
+        <w:keepLines/>
+        <w:widowControl/>
+        <w:spacing w:before="120" w:after="60" w:line="330" w:lineRule="exact"/>
         <w:rPr>
           <w:rFonts w:ascii="Microsoft YaHei" w:hAnsi="Microsoft YaHei" w:eastAsia="微软雅黑"/>
           <w:color w:val="202B3B"/>
@@ -545,16 +638,18 @@
           <w:rFonts w:hint="eastAsia" w:ascii="微软雅黑" w:hAnsi="微软雅黑" w:eastAsia="微软雅黑" w:cs="微软雅黑"/>
           <w:b w:val="1"/>
           <w:color w:val="202B3B"/>
-          <w:sz w:val="17"/>
+          <w:sz w:val="21"/>
           <w:szCs w:val="17"/>
         </w:rPr>
-        <w:t>医学推荐助手 Agent 开发</w:t>
+        <w:t>医学信息抽取流水线</w:t>
       </w:r>
     </w:p>
     <w:p>
       <w:pPr>
         <w:pStyle w:val="000002"/>
-        <w:spacing w:before="0" w:after="0" w:line="310" w:lineRule="exact"/>
+        <w:keepLines/>
+        <w:widowControl/>
+        <w:spacing w:before="0" w:after="60" w:line="330" w:lineRule="exact"/>
         <w:ind w:left="196" w:hanging="142"/>
         <w:rPr>
           <w:rFonts w:ascii="Microsoft YaHei" w:hAnsi="Microsoft YaHei" w:eastAsia="微软雅黑"/>
@@ -566,16 +661,41 @@
         <w:rPr>
           <w:rFonts w:hint="eastAsia" w:ascii="微软雅黑" w:hAnsi="微软雅黑" w:eastAsia="微软雅黑" w:cs="微软雅黑"/>
           <w:color w:val="202B3B"/>
-          <w:sz w:val="17"/>
+          <w:sz w:val="21"/>
           <w:szCs w:val="17"/>
         </w:rPr>
-        <w:t>• 设计疾病信号通路在线推荐链路，实现疾病识别与扩展、知识图谱与 PubMed 并行检索、通路对齐、多源融合排序、LLM 流式总结及 Excel 报告生成；基于 FastAPI 接入 Memgraph、Elasticsearch、Milvus、MinIO。</w:t>
+        <w:t>• 面向百万级医学文献构建 LLM 驱动的信息抽取 Pipeline，设计“实体抽取-关系识别-结果验证”多阶段工作流，自动生成疾病-信号通路调控关系三元组，支撑医学知识图谱构建。</w:t>
       </w:r>
     </w:p>
     <w:p>
       <w:pPr>
         <w:pStyle w:val="000002"/>
-        <w:spacing w:before="20" w:after="40" w:line="310" w:lineRule="exact"/>
+        <w:keepLines/>
+        <w:widowControl/>
+        <w:spacing w:before="0" w:after="60" w:line="330" w:lineRule="exact"/>
+        <w:ind w:left="196" w:hanging="142"/>
+        <w:rPr>
+          <w:rFonts w:ascii="Microsoft YaHei" w:hAnsi="Microsoft YaHei" w:eastAsia="微软雅黑"/>
+          <w:color w:val="202B3B"/>
+          <w:sz w:val="17"/>
+        </w:rPr>
+      </w:pPr>
+      <w:r>
+        <w:rPr>
+          <w:rFonts w:hint="eastAsia" w:ascii="微软雅黑" w:hAnsi="微软雅黑" w:eastAsia="微软雅黑" w:cs="微软雅黑"/>
+          <w:color w:val="202B3B"/>
+          <w:sz w:val="21"/>
+          <w:szCs w:val="17"/>
+        </w:rPr>
+        <w:t>• 针对医学关系抽取任务进行 LLM Workflow 优化，对比 LangGraph 逐实体对判别方案与段落级批量抽取方案，最终设计“实体联合抽取 → 上下文关系判别”的高效 Pipeline，并构建自动化评测体系；通过流程重构与 Prompt 优化，实现 Recall 63%→82%、Accuracy 72%→87%，模型调用成本降低 95%+。</w:t>
+      </w:r>
+    </w:p>
+    <w:p>
+      <w:pPr>
+        <w:pStyle w:val="000002"/>
+        <w:keepLines/>
+        <w:widowControl/>
+        <w:spacing w:before="20" w:after="100" w:line="330" w:lineRule="exact"/>
         <w:ind w:left="196"/>
         <w:rPr>
           <w:rFonts w:ascii="Microsoft YaHei" w:hAnsi="Microsoft YaHei" w:eastAsia="微软雅黑"/>
@@ -588,7 +708,7 @@
           <w:rFonts w:hint="eastAsia" w:ascii="微软雅黑" w:hAnsi="微软雅黑" w:eastAsia="微软雅黑" w:cs="微软雅黑"/>
           <w:b w:val="1"/>
           <w:color w:val="4A5A6E"/>
-          <w:sz w:val="17"/>
+          <w:sz w:val="19"/>
           <w:szCs w:val="17"/>
         </w:rPr>
         <w:t>技术栈：</w:t>
@@ -597,7 +717,87 @@
         <w:rPr>
           <w:rFonts w:hint="eastAsia" w:ascii="微软雅黑" w:hAnsi="微软雅黑" w:eastAsia="微软雅黑" w:cs="微软雅黑"/>
           <w:color w:val="4A5A6E"/>
+          <w:sz w:val="19"/>
+          <w:szCs w:val="17"/>
+        </w:rPr>
+        <w:t>Python、LLM 多阶段抽取、LangGraph、Prompt 工程、自动化评测体系</w:t>
+      </w:r>
+    </w:p>
+    <w:p>
+      <w:pPr>
+        <w:pStyle w:val="000002"/>
+        <w:keepNext/>
+        <w:keepLines/>
+        <w:widowControl/>
+        <w:spacing w:before="120" w:after="60" w:line="330" w:lineRule="exact"/>
+        <w:rPr>
+          <w:rFonts w:ascii="Microsoft YaHei" w:hAnsi="Microsoft YaHei" w:eastAsia="微软雅黑"/>
+          <w:color w:val="202B3B"/>
           <w:sz w:val="17"/>
+        </w:rPr>
+      </w:pPr>
+      <w:r>
+        <w:rPr>
+          <w:rFonts w:hint="eastAsia" w:ascii="微软雅黑" w:hAnsi="微软雅黑" w:eastAsia="微软雅黑" w:cs="微软雅黑"/>
+          <w:b w:val="1"/>
+          <w:color w:val="202B3B"/>
+          <w:sz w:val="21"/>
+          <w:szCs w:val="17"/>
+        </w:rPr>
+        <w:t>医学推荐助手 Agent 开发</w:t>
+      </w:r>
+    </w:p>
+    <w:p>
+      <w:pPr>
+        <w:pStyle w:val="000002"/>
+        <w:keepLines/>
+        <w:widowControl/>
+        <w:spacing w:before="0" w:after="60" w:line="330" w:lineRule="exact"/>
+        <w:ind w:left="196" w:hanging="142"/>
+        <w:rPr>
+          <w:rFonts w:ascii="Microsoft YaHei" w:hAnsi="Microsoft YaHei" w:eastAsia="微软雅黑"/>
+          <w:color w:val="202B3B"/>
+          <w:sz w:val="17"/>
+        </w:rPr>
+      </w:pPr>
+      <w:r>
+        <w:rPr>
+          <w:rFonts w:hint="eastAsia" w:ascii="微软雅黑" w:hAnsi="微软雅黑" w:eastAsia="微软雅黑" w:cs="微软雅黑"/>
+          <w:color w:val="202B3B"/>
+          <w:sz w:val="21"/>
+          <w:szCs w:val="17"/>
+        </w:rPr>
+        <w:t>• 设计疾病信号通路在线推荐链路，实现疾病识别与扩展、知识图谱与 PubMed 并行检索、通路对齐、多源融合排序、LLM 流式总结及 Excel 报告生成；基于 FastAPI 接入 Memgraph、Elasticsearch、Milvus、MinIO。</w:t>
+      </w:r>
+    </w:p>
+    <w:p>
+      <w:pPr>
+        <w:pStyle w:val="000002"/>
+        <w:keepLines/>
+        <w:widowControl/>
+        <w:spacing w:before="20" w:after="100" w:line="330" w:lineRule="exact"/>
+        <w:ind w:left="196"/>
+        <w:rPr>
+          <w:rFonts w:ascii="Microsoft YaHei" w:hAnsi="Microsoft YaHei" w:eastAsia="微软雅黑"/>
+          <w:color w:val="202B3B"/>
+          <w:sz w:val="17"/>
+        </w:rPr>
+      </w:pPr>
+      <w:r>
+        <w:rPr>
+          <w:rFonts w:hint="eastAsia" w:ascii="微软雅黑" w:hAnsi="微软雅黑" w:eastAsia="微软雅黑" w:cs="微软雅黑"/>
+          <w:b w:val="1"/>
+          <w:color w:val="4A5A6E"/>
+          <w:sz w:val="19"/>
+          <w:szCs w:val="17"/>
+        </w:rPr>
+        <w:t>技术栈：</w:t>
+      </w:r>
+      <w:r>
+        <w:rPr>
+          <w:rFonts w:hint="eastAsia" w:ascii="微软雅黑" w:hAnsi="微软雅黑" w:eastAsia="微软雅黑" w:cs="微软雅黑"/>
+          <w:color w:val="4A5A6E"/>
+          <w:sz w:val="19"/>
           <w:szCs w:val="17"/>
         </w:rPr>
         <w:t>Python、FastAPI、Memgraph、Elasticsearch、Milvus、MinIO、PubMed、LLM 流式生成、Excel 报告导出</w:t>
@@ -605,72 +805,81 @@
     </w:p>
     <w:p>
       <w:pPr>
-        <w:widowControl w:val="0"/>
+        <w:keepLines/>
+        <w:widowControl/>
+        <w:spacing w:before="0" w:after="60" w:lineRule="exact" w:line="330"/>
       </w:pPr>
       <w:r>
         <w:rPr>
           <w:rFonts w:hint="eastAsia" w:ascii="Microsoft YaHei" w:hAnsi="Microsoft YaHei" w:eastAsia="微软雅黑"/>
           <w:b w:val="0"/>
           <w:color w:val="202B3B"/>
-          <w:sz w:val="17"/>
+          <w:sz w:val="21"/>
         </w:rPr>
         <w:t>纷享销客｜CRM 实施顾问｜武汉｜2024.07—2024.12：参与需求调研及 CRM 系统定制化开发。</w:t>
       </w:r>
     </w:p>
     <w:p>
       <w:pPr>
-        <w:keepNext w:val="1"/>
-        <w:widowControl w:val="0"/>
-        <w:spacing w:before="140" w:after="80" w:line="320" w:lineRule="exact"/>
+        <w:keepNext/>
+        <w:keepLines/>
+        <w:widowControl/>
+        <w:spacing w:before="180" w:after="100" w:line="340" w:lineRule="exact"/>
       </w:pPr>
       <w:r>
         <w:rPr>
           <w:rFonts w:hint="eastAsia" w:ascii="Microsoft YaHei" w:hAnsi="Microsoft YaHei" w:eastAsia="微软雅黑"/>
           <w:b w:val="1"/>
           <w:color w:val="235689"/>
-          <w:sz w:val="21"/>
+          <w:sz w:val="24"/>
         </w:rPr>
         <w:t>教育经历</w:t>
       </w:r>
     </w:p>
     <w:p>
       <w:pPr>
-        <w:widowControl w:val="0"/>
+        <w:keepLines/>
+        <w:widowControl/>
+        <w:spacing w:before="0" w:after="60" w:lineRule="exact" w:line="330"/>
       </w:pPr>
       <w:r>
         <w:rPr>
           <w:rFonts w:hint="eastAsia" w:ascii="Microsoft YaHei" w:hAnsi="Microsoft YaHei" w:eastAsia="微软雅黑"/>
           <w:b w:val="0"/>
           <w:color w:val="202B3B"/>
-          <w:sz w:val="17"/>
+          <w:sz w:val="21"/>
         </w:rPr>
         <w:t>北京科技大学｜人工智能科学与工程｜硕士在读｜2025.09—至今</w:t>
       </w:r>
     </w:p>
     <w:p>
       <w:pPr>
-        <w:widowControl w:val="0"/>
+        <w:keepLines/>
+        <w:widowControl/>
+        <w:spacing w:before="0" w:after="60" w:lineRule="exact" w:line="330"/>
       </w:pPr>
       <w:r>
         <w:rPr>
           <w:rFonts w:hint="eastAsia" w:ascii="Microsoft YaHei" w:hAnsi="Microsoft YaHei" w:eastAsia="微软雅黑"/>
           <w:b w:val="0"/>
           <w:color w:val="202B3B"/>
-          <w:sz w:val="17"/>
+          <w:sz w:val="21"/>
         </w:rPr>
         <w:t>武汉理工大学｜信息管理与信息系统｜本科｜2021.09—2025.06</w:t>
       </w:r>
     </w:p>
     <w:p>
       <w:pPr>
-        <w:widowControl w:val="0"/>
+        <w:keepLines/>
+        <w:widowControl/>
+        <w:spacing w:before="80" w:after="60" w:lineRule="exact" w:line="330"/>
       </w:pPr>
       <w:r>
         <w:rPr>
           <w:rFonts w:hint="eastAsia" w:ascii="Microsoft YaHei" w:hAnsi="Microsoft YaHei" w:eastAsia="微软雅黑"/>
           <w:b w:val="0"/>
           <w:color w:val="202B3B"/>
-          <w:sz w:val="16"/>
+          <w:sz w:val="18"/>
         </w:rPr>
         <w:t>奖项：国家励志奖学金｜校三好学生｜数学建模校三等奖｜市场调查分析大赛校二等奖｜英语四级 600+｜英语六级 500+</w:t>
       </w:r>

</xml_diff>

<commit_message>
resume: add unified encoder project v0004-b9e79f99
</commit_message>
<xml_diff>
--- a/latest/resume.docx
+++ b/latest/resume.docx
@@ -111,6 +111,99 @@
           <w:sz w:val="22"/>
         </w:rPr>
         <w:t>项目经历</w:t>
+      </w:r>
+    </w:p>
+    <w:p>
+      <w:pPr>
+        <w:keepNext/>
+        <w:keepLines/>
+        <w:pageBreakBefore w:val="0"/>
+        <w:widowControl/>
+        <w:spacing w:before="60" w:line="290" w:lineRule="exact" w:after="40"/>
+      </w:pPr>
+      <w:r>
+        <w:rPr>
+          <w:rFonts w:hint="eastAsia" w:ascii="Microsoft YaHei" w:hAnsi="Microsoft YaHei" w:eastAsia="微软雅黑"/>
+          <w:b w:val="1"/>
+          <w:color w:val="202B3B"/>
+          <w:sz w:val="21"/>
+        </w:rPr>
+        <w:t>跨领域统一编码器训练与优化（以赛代评）｜2026.10</w:t>
+      </w:r>
+    </w:p>
+    <w:p>
+      <w:pPr>
+        <w:pStyle w:val="000002"/>
+        <w:keepNext w:val="0"/>
+        <w:keepLines/>
+        <w:pageBreakBefore w:val="0"/>
+        <w:widowControl/>
+        <w:spacing w:before="0" w:after="30" w:line="284" w:lineRule="exact"/>
+        <w:ind w:left="196" w:hanging="142"/>
+        <w:rPr>
+          <w:rFonts w:ascii="Microsoft YaHei" w:hAnsi="Microsoft YaHei" w:eastAsia="微软雅黑"/>
+          <w:color w:val="202B3B"/>
+          <w:sz w:val="17"/>
+        </w:rPr>
+      </w:pPr>
+      <w:r>
+        <w:rPr>
+          <w:rFonts w:hint="eastAsia" w:ascii="微软雅黑" w:hAnsi="微软雅黑" w:eastAsia="微软雅黑" w:cs="微软雅黑"/>
+          <w:color w:val="202B3B"/>
+          <w:sz w:val="21"/>
+          <w:szCs w:val="17"/>
+        </w:rPr>
+        <w:t>• 设计覆盖四领域、13 个数据集、90 个任务的共享训练、冻结表征与独立预测头评测全流程；按验证集锁定完整模型后执行测试。</w:t>
+      </w:r>
+    </w:p>
+    <w:p>
+      <w:pPr>
+        <w:pStyle w:val="000002"/>
+        <w:keepNext w:val="0"/>
+        <w:keepLines/>
+        <w:pageBreakBefore w:val="0"/>
+        <w:widowControl/>
+        <w:spacing w:before="0" w:after="30" w:line="284" w:lineRule="exact"/>
+        <w:ind w:left="196" w:hanging="142"/>
+        <w:rPr>
+          <w:rFonts w:ascii="Microsoft YaHei" w:hAnsi="Microsoft YaHei" w:eastAsia="微软雅黑"/>
+          <w:color w:val="202B3B"/>
+          <w:sz w:val="17"/>
+        </w:rPr>
+      </w:pPr>
+      <w:r>
+        <w:rPr>
+          <w:rFonts w:hint="eastAsia" w:ascii="微软雅黑" w:hAnsi="微软雅黑" w:eastAsia="微软雅黑" w:cs="微软雅黑"/>
+          <w:color w:val="202B3B"/>
+          <w:sz w:val="21"/>
+          <w:szCs w:val="17"/>
+        </w:rPr>
+        <w:t>• 基于 PyTorch 融合 D-MPNN 分子图、PaiNN 三维结构与本队自训序列 CNN，输出统一 256 维表示；结合四卡数据并行、均衡重放与分阶段解冻迭代架构及训练策略。</w:t>
+      </w:r>
+    </w:p>
+    <w:p>
+      <w:pPr>
+        <w:pStyle w:val="000002"/>
+        <w:keepNext w:val="0"/>
+        <w:keepLines/>
+        <w:pageBreakBefore w:val="0"/>
+        <w:widowControl/>
+        <w:spacing w:before="0" w:after="30" w:line="284" w:lineRule="exact"/>
+        <w:ind w:left="196" w:hanging="142"/>
+        <w:rPr>
+          <w:rFonts w:ascii="Microsoft YaHei" w:hAnsi="Microsoft YaHei" w:eastAsia="微软雅黑"/>
+          <w:color w:val="202B3B"/>
+          <w:sz w:val="17"/>
+        </w:rPr>
+      </w:pPr>
+      <w:r>
+        <w:rPr>
+          <w:rFonts w:hint="eastAsia" w:ascii="微软雅黑" w:hAnsi="微软雅黑" w:eastAsia="微软雅黑" w:cs="微软雅黑"/>
+          <w:color w:val="202B3B"/>
+          <w:sz w:val="21"/>
+          <w:szCs w:val="17"/>
+        </w:rPr>
+        <w:t>• 将 A-validation 综合分由 71.16 提升至 74.49（+3.33 分）；最终 A-test 72.78 分，90 项官方脚本本地评分与一致性检查通过，非正式榜单成绩。</w:t>
       </w:r>
     </w:p>
     <w:p>

</xml_diff>